<commit_message>
DLPXECO-13985 Add pros/cons breakdown and reformat design doc
Co-Authored-By: Claude Sonnet 4.6 <noreply@anthropic.com>
</commit_message>
<xml_diff>
--- a/docs/DLPXECO-13985-architecture-design.docx
+++ b/docs/DLPXECO-13985-architecture-design.docx
@@ -2,7 +2,57 @@
 <file path=word/document.xml><?xml version="1.0" encoding="utf-8"?>
 <w:document xmlns:w="http://schemas.openxmlformats.org/wordprocessingml/2006/main" xmlns:m="http://schemas.openxmlformats.org/officeDocument/2006/math" xmlns:r="http://schemas.openxmlformats.org/officeDocument/2006/relationships" xmlns:o="urn:schemas-microsoft-com:office:office" xmlns:v="urn:schemas-microsoft-com:vml" xmlns:w10="urn:schemas-microsoft-com:office:word" xmlns:a="http://schemas.openxmlformats.org/drawingml/2006/main" xmlns:pic="http://schemas.openxmlformats.org/drawingml/2006/picture" xmlns:wp="http://schemas.openxmlformats.org/drawingml/2006/wordprocessingDrawing">
   <w:body>
-    <w:bookmarkStart w:id="28" w:name="feature-design-dlpxeco-13985"/>
+    <w:p>
+      <w:pPr>
+        <w:pStyle w:val="Title"/>
+      </w:pPr>
+      <w:r>
+        <w:t xml:space="preserve">3-Tool Dynamic API Architecture — DCT MCP Server</w:t>
+      </w:r>
+    </w:p>
+    <w:p>
+      <w:pPr>
+        <w:pStyle w:val="Author"/>
+      </w:pPr>
+      <w:r>
+        <w:t xml:space="preserve">Vinay Byrappa</w:t>
+      </w:r>
+    </w:p>
+    <w:p>
+      <w:pPr>
+        <w:pStyle w:val="Date"/>
+      </w:pPr>
+      <w:r>
+        <w:t xml:space="preserve">May 16, 2026</w:t>
+      </w:r>
+    </w:p>
+    <w:sdt>
+      <w:sdtPr>
+        <w:docPartObj>
+          <w:docPartGallery w:val="Table of Contents"/>
+          <w:docPartUnique/>
+        </w:docPartObj>
+      </w:sdtPr>
+      <w:sdtContent>
+        <w:p>
+          <w:pPr>
+            <w:pStyle w:val="TOCHeading"/>
+          </w:pPr>
+          <w:r>
+            <w:t xml:space="preserve">Table of Contents</w:t>
+          </w:r>
+        </w:p>
+        <w:p>
+          <w:r>
+            <w:fldChar w:fldCharType="begin" w:dirty="true"/>
+            <w:instrText xml:space="preserve">TOC \o "1-3" \h \z \u</w:instrText>
+            <w:fldChar w:fldCharType="separate"/>
+            <w:fldChar w:fldCharType="end"/>
+          </w:r>
+        </w:p>
+      </w:sdtContent>
+    </w:sdt>
+    <w:bookmarkStart w:id="29" w:name="feature-design-dlpxeco-13985"/>
     <w:p>
       <w:pPr>
         <w:pStyle w:val="Heading1"/>
@@ -2284,7 +2334,7 @@
       </w:r>
     </w:p>
     <w:bookmarkEnd w:id="16"/>
-    <w:bookmarkStart w:id="25" w:name="X9e64edd6fc60c847680e6d3d467592253e92318"/>
+    <w:bookmarkStart w:id="26" w:name="X9e64edd6fc60c847680e6d3d467592253e92318"/>
     <w:p>
       <w:pPr>
         <w:pStyle w:val="Heading2"/>
@@ -4877,7 +4927,733 @@
       </w:r>
     </w:p>
     <w:bookmarkEnd w:id="23"/>
-    <w:bookmarkStart w:id="24" w:name="migration-path-qr-2-compliance"/>
+    <w:bookmarkStart w:id="24" w:name="pros-and-cons"/>
+    <w:p>
+      <w:pPr>
+        <w:pStyle w:val="Heading3"/>
+      </w:pPr>
+      <w:r>
+        <w:t xml:space="preserve">Pros and Cons</w:t>
+      </w:r>
+    </w:p>
+    <w:p>
+      <w:pPr>
+        <w:pStyle w:val="FirstParagraph"/>
+      </w:pPr>
+      <w:r>
+        <w:rPr>
+          <w:b/>
+          <w:bCs/>
+        </w:rPr>
+        <w:t xml:space="preserve">Auto Mode (</w:t>
+      </w:r>
+      <w:r>
+        <w:rPr>
+          <w:rStyle w:val="VerbatimChar"/>
+          <w:b/>
+          <w:bCs/>
+        </w:rPr>
+        <w:t xml:space="preserve">DCT_TOOLSET=auto</w:t>
+      </w:r>
+      <w:r>
+        <w:rPr>
+          <w:b/>
+          <w:bCs/>
+        </w:rPr>
+        <w:t xml:space="preserve">)</w:t>
+      </w:r>
+    </w:p>
+    <w:tbl>
+      <w:tblPr>
+        <w:tblStyle w:val="Table"/>
+        <w:tblW w:type="pct" w:w="5000"/>
+        <w:tblLayout w:type="fixed"/>
+        <w:tblLook w:firstRow="1" w:lastRow="0" w:firstColumn="0" w:lastColumn="0" w:noHBand="0" w:noVBand="0" w:val="0020"/>
+      </w:tblPr>
+      <w:tblGrid>
+        <w:gridCol w:w="3960"/>
+        <w:gridCol w:w="3960"/>
+      </w:tblGrid>
+      <w:tr>
+        <w:trPr>
+          <w:tblHeader w:val="on"/>
+        </w:trPr>
+        <w:tc>
+          <w:tcPr/>
+          <w:p>
+            <w:pPr>
+              <w:pStyle w:val="Compact"/>
+            </w:pPr>
+          </w:p>
+        </w:tc>
+        <w:tc>
+          <w:tcPr/>
+          <w:p>
+            <w:pPr>
+              <w:pStyle w:val="Compact"/>
+            </w:pPr>
+            <w:r>
+              <w:t xml:space="preserve">Detail</w:t>
+            </w:r>
+          </w:p>
+        </w:tc>
+      </w:tr>
+      <w:tr>
+        <w:tc>
+          <w:tcPr/>
+          <w:p>
+            <w:pPr>
+              <w:pStyle w:val="Compact"/>
+            </w:pPr>
+            <w:r>
+              <w:rPr>
+                <w:b/>
+                <w:bCs/>
+              </w:rPr>
+              <w:t xml:space="preserve">Pro</w:t>
+            </w:r>
+          </w:p>
+        </w:tc>
+        <w:tc>
+          <w:tcPr/>
+          <w:p>
+            <w:pPr>
+              <w:pStyle w:val="Compact"/>
+            </w:pPr>
+            <w:r>
+              <w:t xml:space="preserve">Token-efficient for high-frequency known operations — no List+Get round-trips; LLM calls grouped tool directly</w:t>
+            </w:r>
+          </w:p>
+        </w:tc>
+      </w:tr>
+      <w:tr>
+        <w:tc>
+          <w:tcPr/>
+          <w:p>
+            <w:pPr>
+              <w:pStyle w:val="Compact"/>
+            </w:pPr>
+            <w:r>
+              <w:rPr>
+                <w:b/>
+                <w:bCs/>
+              </w:rPr>
+              <w:t xml:space="preserve">Pro</w:t>
+            </w:r>
+          </w:p>
+        </w:tc>
+        <w:tc>
+          <w:tcPr/>
+          <w:p>
+            <w:pPr>
+              <w:pStyle w:val="Compact"/>
+            </w:pPr>
+            <w:r>
+              <w:t xml:space="preserve">Curated tool descriptions give the LLM richer context about related operations (e.g., all VDB actions in one tool)</w:t>
+            </w:r>
+          </w:p>
+        </w:tc>
+      </w:tr>
+      <w:tr>
+        <w:tc>
+          <w:tcPr/>
+          <w:p>
+            <w:pPr>
+              <w:pStyle w:val="Compact"/>
+            </w:pPr>
+            <w:r>
+              <w:rPr>
+                <w:b/>
+                <w:bCs/>
+              </w:rPr>
+              <w:t xml:space="preserve">Pro</w:t>
+            </w:r>
+          </w:p>
+        </w:tc>
+        <w:tc>
+          <w:tcPr/>
+          <w:p>
+            <w:pPr>
+              <w:pStyle w:val="Compact"/>
+            </w:pPr>
+            <w:r>
+              <w:t xml:space="preserve">Lower interaction latency — 1 LLM call instead of 2–3 for a known operation</w:t>
+            </w:r>
+          </w:p>
+        </w:tc>
+      </w:tr>
+      <w:tr>
+        <w:tc>
+          <w:tcPr/>
+          <w:p>
+            <w:pPr>
+              <w:pStyle w:val="Compact"/>
+            </w:pPr>
+            <w:r>
+              <w:rPr>
+                <w:b/>
+                <w:bCs/>
+              </w:rPr>
+              <w:t xml:space="preserve">Pro</w:t>
+            </w:r>
+          </w:p>
+        </w:tc>
+        <w:tc>
+          <w:tcPr/>
+          <w:p>
+            <w:pPr>
+              <w:pStyle w:val="Compact"/>
+            </w:pPr>
+            <w:r>
+              <w:t xml:space="preserve">Battle-tested in production; existing toolsets are well-exercised and validated</w:t>
+            </w:r>
+          </w:p>
+        </w:tc>
+      </w:tr>
+      <w:tr>
+        <w:tc>
+          <w:tcPr/>
+          <w:p>
+            <w:pPr>
+              <w:pStyle w:val="Compact"/>
+            </w:pPr>
+            <w:r>
+              <w:rPr>
+                <w:b/>
+                <w:bCs/>
+              </w:rPr>
+              <w:t xml:space="preserve">Pro</w:t>
+            </w:r>
+          </w:p>
+        </w:tc>
+        <w:tc>
+          <w:tcPr/>
+          <w:p>
+            <w:pPr>
+              <w:pStyle w:val="Compact"/>
+            </w:pPr>
+            <w:r>
+              <w:t xml:space="preserve">Full VS Code Copilot support without restart limitations for fixed toolset use</w:t>
+            </w:r>
+          </w:p>
+        </w:tc>
+      </w:tr>
+      <w:tr>
+        <w:tc>
+          <w:tcPr/>
+          <w:p>
+            <w:pPr>
+              <w:pStyle w:val="Compact"/>
+            </w:pPr>
+            <w:r>
+              <w:rPr>
+                <w:b/>
+                <w:bCs/>
+              </w:rPr>
+              <w:t xml:space="preserve">Con</w:t>
+            </w:r>
+          </w:p>
+        </w:tc>
+        <w:tc>
+          <w:tcPr/>
+          <w:p>
+            <w:pPr>
+              <w:pStyle w:val="Compact"/>
+            </w:pPr>
+            <w:r>
+              <w:t xml:space="preserve">Requires manual code changes (Python +</w:t>
+            </w:r>
+            <w:r>
+              <w:t xml:space="preserve"> </w:t>
+            </w:r>
+            <w:r>
+              <w:rPr>
+                <w:rStyle w:val="VerbatimChar"/>
+              </w:rPr>
+              <w:t xml:space="preserve">.txt</w:t>
+            </w:r>
+            <w:r>
+              <w:t xml:space="preserve"> </w:t>
+            </w:r>
+            <w:r>
+              <w:t xml:space="preserve">config) every time DCT adds new API endpoints</w:t>
+            </w:r>
+          </w:p>
+        </w:tc>
+      </w:tr>
+      <w:tr>
+        <w:tc>
+          <w:tcPr/>
+          <w:p>
+            <w:pPr>
+              <w:pStyle w:val="Compact"/>
+            </w:pPr>
+            <w:r>
+              <w:rPr>
+                <w:b/>
+                <w:bCs/>
+              </w:rPr>
+              <w:t xml:space="preserve">Con</w:t>
+            </w:r>
+          </w:p>
+        </w:tc>
+        <w:tc>
+          <w:tcPr/>
+          <w:p>
+            <w:pPr>
+              <w:pStyle w:val="Compact"/>
+            </w:pPr>
+            <w:r>
+              <w:t xml:space="preserve">Lags DCT API releases; new endpoints inaccessible until the next MCP server release cycle</w:t>
+            </w:r>
+          </w:p>
+        </w:tc>
+      </w:tr>
+      <w:tr>
+        <w:tc>
+          <w:tcPr/>
+          <w:p>
+            <w:pPr>
+              <w:pStyle w:val="Compact"/>
+            </w:pPr>
+            <w:r>
+              <w:rPr>
+                <w:b/>
+                <w:bCs/>
+              </w:rPr>
+              <w:t xml:space="preserve">Con</w:t>
+            </w:r>
+          </w:p>
+        </w:tc>
+        <w:tc>
+          <w:tcPr/>
+          <w:p>
+            <w:pPr>
+              <w:pStyle w:val="Compact"/>
+            </w:pPr>
+            <w:r>
+              <w:t xml:space="preserve">Tool count balloons after enabling multiple toolsets (~70+ tools exposed simultaneously), increasing LLM context size</w:t>
+            </w:r>
+          </w:p>
+        </w:tc>
+      </w:tr>
+      <w:tr>
+        <w:tc>
+          <w:tcPr/>
+          <w:p>
+            <w:pPr>
+              <w:pStyle w:val="Compact"/>
+            </w:pPr>
+            <w:r>
+              <w:rPr>
+                <w:b/>
+                <w:bCs/>
+              </w:rPr>
+              <w:t xml:space="preserve">Con</w:t>
+            </w:r>
+          </w:p>
+        </w:tc>
+        <w:tc>
+          <w:tcPr/>
+          <w:p>
+            <w:pPr>
+              <w:pStyle w:val="Compact"/>
+            </w:pPr>
+            <w:r>
+              <w:t xml:space="preserve">Not suited for exploratory workflows (</w:t>
+            </w:r>
+            <w:r>
+              <w:t xml:space="preserve">“what can this DCT deployment support?”</w:t>
+            </w:r>
+            <w:r>
+              <w:t xml:space="preserve">)</w:t>
+            </w:r>
+          </w:p>
+        </w:tc>
+      </w:tr>
+      <w:tr>
+        <w:tc>
+          <w:tcPr/>
+          <w:p>
+            <w:pPr>
+              <w:pStyle w:val="Compact"/>
+            </w:pPr>
+            <w:r>
+              <w:rPr>
+                <w:b/>
+                <w:bCs/>
+              </w:rPr>
+              <w:t xml:space="preserve">Con</w:t>
+            </w:r>
+          </w:p>
+        </w:tc>
+        <w:tc>
+          <w:tcPr/>
+          <w:p>
+            <w:pPr>
+              <w:pStyle w:val="Compact"/>
+            </w:pPr>
+            <w:r>
+              <w:rPr>
+                <w:rStyle w:val="VerbatimChar"/>
+              </w:rPr>
+              <w:t xml:space="preserve">tools/list_changed</w:t>
+            </w:r>
+            <w:r>
+              <w:t xml:space="preserve"> </w:t>
+            </w:r>
+            <w:r>
+              <w:t xml:space="preserve">MCP notifications required for runtime toolset hot-switching; VS Code Copilot requires chat restart</w:t>
+            </w:r>
+          </w:p>
+        </w:tc>
+      </w:tr>
+    </w:tbl>
+    <w:p>
+      <w:pPr>
+        <w:pStyle w:val="BodyText"/>
+      </w:pPr>
+      <w:r>
+        <w:rPr>
+          <w:b/>
+          <w:bCs/>
+        </w:rPr>
+        <w:t xml:space="preserve">Dynamic Mode (</w:t>
+      </w:r>
+      <w:r>
+        <w:rPr>
+          <w:rStyle w:val="VerbatimChar"/>
+          <w:b/>
+          <w:bCs/>
+        </w:rPr>
+        <w:t xml:space="preserve">DCT_TOOLSET=dynamic</w:t>
+      </w:r>
+      <w:r>
+        <w:rPr>
+          <w:b/>
+          <w:bCs/>
+        </w:rPr>
+        <w:t xml:space="preserve">)</w:t>
+      </w:r>
+    </w:p>
+    <w:tbl>
+      <w:tblPr>
+        <w:tblStyle w:val="Table"/>
+        <w:tblW w:type="pct" w:w="5000"/>
+        <w:tblLayout w:type="fixed"/>
+        <w:tblLook w:firstRow="1" w:lastRow="0" w:firstColumn="0" w:lastColumn="0" w:noHBand="0" w:noVBand="0" w:val="0020"/>
+      </w:tblPr>
+      <w:tblGrid>
+        <w:gridCol w:w="3960"/>
+        <w:gridCol w:w="3960"/>
+      </w:tblGrid>
+      <w:tr>
+        <w:trPr>
+          <w:tblHeader w:val="on"/>
+        </w:trPr>
+        <w:tc>
+          <w:tcPr/>
+          <w:p>
+            <w:pPr>
+              <w:pStyle w:val="Compact"/>
+            </w:pPr>
+          </w:p>
+        </w:tc>
+        <w:tc>
+          <w:tcPr/>
+          <w:p>
+            <w:pPr>
+              <w:pStyle w:val="Compact"/>
+            </w:pPr>
+            <w:r>
+              <w:t xml:space="preserve">Detail</w:t>
+            </w:r>
+          </w:p>
+        </w:tc>
+      </w:tr>
+      <w:tr>
+        <w:tc>
+          <w:tcPr/>
+          <w:p>
+            <w:pPr>
+              <w:pStyle w:val="Compact"/>
+            </w:pPr>
+            <w:r>
+              <w:rPr>
+                <w:b/>
+                <w:bCs/>
+              </w:rPr>
+              <w:t xml:space="preserve">Pro</w:t>
+            </w:r>
+          </w:p>
+        </w:tc>
+        <w:tc>
+          <w:tcPr/>
+          <w:p>
+            <w:pPr>
+              <w:pStyle w:val="Compact"/>
+            </w:pPr>
+            <w:r>
+              <w:t xml:space="preserve">Zero maintenance when DCT adds new endpoints — OpenAPI spec drives discovery automatically at startup</w:t>
+            </w:r>
+          </w:p>
+        </w:tc>
+      </w:tr>
+      <w:tr>
+        <w:tc>
+          <w:tcPr/>
+          <w:p>
+            <w:pPr>
+              <w:pStyle w:val="Compact"/>
+            </w:pPr>
+            <w:r>
+              <w:rPr>
+                <w:b/>
+                <w:bCs/>
+              </w:rPr>
+              <w:t xml:space="preserve">Pro</w:t>
+            </w:r>
+          </w:p>
+        </w:tc>
+        <w:tc>
+          <w:tcPr/>
+          <w:p>
+            <w:pPr>
+              <w:pStyle w:val="Compact"/>
+            </w:pPr>
+            <w:r>
+              <w:t xml:space="preserve">Always reflects the live DCT API surface; no MCP server update needed after DCT releases</w:t>
+            </w:r>
+          </w:p>
+        </w:tc>
+      </w:tr>
+      <w:tr>
+        <w:tc>
+          <w:tcPr/>
+          <w:p>
+            <w:pPr>
+              <w:pStyle w:val="Compact"/>
+            </w:pPr>
+            <w:r>
+              <w:rPr>
+                <w:b/>
+                <w:bCs/>
+              </w:rPr>
+              <w:t xml:space="preserve">Pro</w:t>
+            </w:r>
+          </w:p>
+        </w:tc>
+        <w:tc>
+          <w:tcPr/>
+          <w:p>
+            <w:pPr>
+              <w:pStyle w:val="Compact"/>
+            </w:pPr>
+            <w:r>
+              <w:t xml:space="preserve">Fixed tool count (always 3) regardless of DCT API scope — no context window bloat</w:t>
+            </w:r>
+          </w:p>
+        </w:tc>
+      </w:tr>
+      <w:tr>
+        <w:tc>
+          <w:tcPr/>
+          <w:p>
+            <w:pPr>
+              <w:pStyle w:val="Compact"/>
+            </w:pPr>
+            <w:r>
+              <w:rPr>
+                <w:b/>
+                <w:bCs/>
+              </w:rPr>
+              <w:t xml:space="preserve">Pro</w:t>
+            </w:r>
+          </w:p>
+        </w:tc>
+        <w:tc>
+          <w:tcPr/>
+          <w:p>
+            <w:pPr>
+              <w:pStyle w:val="Compact"/>
+            </w:pPr>
+            <w:r>
+              <w:t xml:space="preserve">Schema validation before dispatch catches malformed LLM requests before any DCT network call</w:t>
+            </w:r>
+          </w:p>
+        </w:tc>
+      </w:tr>
+      <w:tr>
+        <w:tc>
+          <w:tcPr/>
+          <w:p>
+            <w:pPr>
+              <w:pStyle w:val="Compact"/>
+            </w:pPr>
+            <w:r>
+              <w:rPr>
+                <w:b/>
+                <w:bCs/>
+              </w:rPr>
+              <w:t xml:space="preserve">Pro</w:t>
+            </w:r>
+          </w:p>
+        </w:tc>
+        <w:tc>
+          <w:tcPr/>
+          <w:p>
+            <w:pPr>
+              <w:pStyle w:val="Compact"/>
+            </w:pPr>
+            <w:r>
+              <w:t xml:space="preserve">No hot-switch complexity; 3 static tools always present; fully compatible with VS Code Copilot without restart</w:t>
+            </w:r>
+          </w:p>
+        </w:tc>
+      </w:tr>
+      <w:tr>
+        <w:tc>
+          <w:tcPr/>
+          <w:p>
+            <w:pPr>
+              <w:pStyle w:val="Compact"/>
+            </w:pPr>
+            <w:r>
+              <w:rPr>
+                <w:b/>
+                <w:bCs/>
+              </w:rPr>
+              <w:t xml:space="preserve">Con</w:t>
+            </w:r>
+          </w:p>
+        </w:tc>
+        <w:tc>
+          <w:tcPr/>
+          <w:p>
+            <w:pPr>
+              <w:pStyle w:val="Compact"/>
+            </w:pPr>
+            <w:r>
+              <w:t xml:space="preserve">Extra LLM round-trips (1–2 List+Get calls) before Execute for operations the LLM hasn’t seen in the session</w:t>
+            </w:r>
+          </w:p>
+        </w:tc>
+      </w:tr>
+      <w:tr>
+        <w:tc>
+          <w:tcPr/>
+          <w:p>
+            <w:pPr>
+              <w:pStyle w:val="Compact"/>
+            </w:pPr>
+            <w:r>
+              <w:rPr>
+                <w:b/>
+                <w:bCs/>
+              </w:rPr>
+              <w:t xml:space="preserve">Con</w:t>
+            </w:r>
+          </w:p>
+        </w:tc>
+        <w:tc>
+          <w:tcPr/>
+          <w:p>
+            <w:pPr>
+              <w:pStyle w:val="Compact"/>
+            </w:pPr>
+            <w:r>
+              <w:t xml:space="preserve">Higher token cost for discovery phase (~1500–3000 tokens for a List call) compared to a direct grouped-tool call</w:t>
+            </w:r>
+          </w:p>
+        </w:tc>
+      </w:tr>
+      <w:tr>
+        <w:tc>
+          <w:tcPr/>
+          <w:p>
+            <w:pPr>
+              <w:pStyle w:val="Compact"/>
+            </w:pPr>
+            <w:r>
+              <w:rPr>
+                <w:b/>
+                <w:bCs/>
+              </w:rPr>
+              <w:t xml:space="preserve">Con</w:t>
+            </w:r>
+          </w:p>
+        </w:tc>
+        <w:tc>
+          <w:tcPr/>
+          <w:p>
+            <w:pPr>
+              <w:pStyle w:val="Compact"/>
+            </w:pPr>
+            <w:r>
+              <w:t xml:space="preserve">LLM must interpret raw OpenAPI schema (from Get) rather than curated, human-written tool descriptions</w:t>
+            </w:r>
+          </w:p>
+        </w:tc>
+      </w:tr>
+      <w:tr>
+        <w:tc>
+          <w:tcPr/>
+          <w:p>
+            <w:pPr>
+              <w:pStyle w:val="Compact"/>
+            </w:pPr>
+            <w:r>
+              <w:rPr>
+                <w:b/>
+                <w:bCs/>
+              </w:rPr>
+              <w:t xml:space="preserve">Con</w:t>
+            </w:r>
+          </w:p>
+        </w:tc>
+        <w:tc>
+          <w:tcPr/>
+          <w:p>
+            <w:pPr>
+              <w:pStyle w:val="Compact"/>
+            </w:pPr>
+            <w:r>
+              <w:t xml:space="preserve">Requires DCT host reachability at startup for freshest spec (mitigated by cache and bundled fallback, but adds startup dependency)</w:t>
+            </w:r>
+          </w:p>
+        </w:tc>
+      </w:tr>
+      <w:tr>
+        <w:tc>
+          <w:tcPr/>
+          <w:p>
+            <w:pPr>
+              <w:pStyle w:val="Compact"/>
+            </w:pPr>
+            <w:r>
+              <w:rPr>
+                <w:b/>
+                <w:bCs/>
+              </w:rPr>
+              <w:t xml:space="preserve">Con</w:t>
+            </w:r>
+          </w:p>
+        </w:tc>
+        <w:tc>
+          <w:tcPr/>
+          <w:p>
+            <w:pPr>
+              <w:pStyle w:val="Compact"/>
+            </w:pPr>
+            <w:r>
+              <w:t xml:space="preserve">New approach — less battle-tested than the existing Auto mode toolsets; evaluation matrix needed before broad rollout</w:t>
+            </w:r>
+          </w:p>
+        </w:tc>
+      </w:tr>
+    </w:tbl>
+    <w:bookmarkEnd w:id="24"/>
+    <w:bookmarkStart w:id="25" w:name="migration-path-qr-2-compliance"/>
     <w:p>
       <w:pPr>
         <w:pStyle w:val="Heading3"/>
@@ -5037,9 +5813,9 @@
         <w:t xml:space="preserve">No data migration, no API key changes, no downtime beyond the normal server restart.</w:t>
       </w:r>
     </w:p>
-    <w:bookmarkEnd w:id="24"/>
     <w:bookmarkEnd w:id="25"/>
-    <w:bookmarkStart w:id="26" w:name="open-questions-risks"/>
+    <w:bookmarkEnd w:id="26"/>
+    <w:bookmarkStart w:id="27" w:name="open-questions-risks"/>
     <w:p>
       <w:pPr>
         <w:pStyle w:val="Heading2"/>
@@ -5225,8 +6001,8 @@
         <w:t xml:space="preserve">. The implementation epic must audit the actual DCT spec for max $ref depth before finalising the cap — Owner: implementation team.</w:t>
       </w:r>
     </w:p>
-    <w:bookmarkEnd w:id="26"/>
-    <w:bookmarkStart w:id="27" w:name="acceptance-criteria"/>
+    <w:bookmarkEnd w:id="27"/>
+    <w:bookmarkStart w:id="28" w:name="acceptance-criteria"/>
     <w:p>
       <w:pPr>
         <w:pStyle w:val="Heading2"/>
@@ -5596,8 +6372,8 @@
         </w:pict>
       </w:r>
     </w:p>
-    <w:bookmarkEnd w:id="27"/>
     <w:bookmarkEnd w:id="28"/>
+    <w:bookmarkEnd w:id="29"/>
     <w:sectPr>
       <w:footnotePr>
         <w:numRestart w:val="eachSect"/>

</xml_diff>